<commit_message>
Align defense slides and notes with reviewed thesis claims
</commit_message>
<xml_diff>
--- a/Molinario_Thesis_Defense_2026_ONLY_SPEAKER_NOTES.docx
+++ b/Molinario_Thesis_Defense_2026_ONLY_SPEAKER_NOTES.docx
@@ -501,20 +501,20 @@
     <w:p/>
     <w:p>
       <w:r>
-        <w:t xml:space="preserve">The first level consists of three transparent proxy models: EfficientNet-B0, ResNet18, and a CLIP-based proxy. These models </w:t>
+        <w:t xml:space="preserve">The first level consists of three transparent, white-box-capable proxy models: EfficientNet-B0, ResNet18, and a CLIP-based supervised classifier. All three expose predictions, gradients, and fold-aware checkpoints; CLIP uses a frozen visual encoder and a supervised binary head.</w:t>
       </w:r>
       <w:r>
         <w:rPr>
           <w:b/>
           <w:bCs/>
         </w:rPr>
-        <w:t>allow</w:t>
-      </w:r>
-      <w:r>
-        <w:t xml:space="preserve"> me to</w:t>
-      </w:r>
-      <w:r>
-        <w:t xml:space="preserve"> inspect predictions, gradients, and fold-aware checkpoints.</w:t>
+        <w:t/>
+      </w:r>
+      <w:r>
+        <w:t xml:space="preserve"/>
+      </w:r>
+      <w:r>
+        <w:t xml:space="preserve"/>
       </w:r>
     </w:p>
     <w:p>
@@ -525,27 +525,27 @@
     <w:p>
       <w:r>
         <w:lastRenderedPageBreak/>
-        <w:t xml:space="preserve">The distinction </w:t>
-      </w:r>
-      <w:r>
-        <w:t xml:space="preserve">between </w:t>
-      </w:r>
-      <w:r>
-        <w:t xml:space="preserve">threat-model </w:t>
-      </w:r>
-      <w:r>
-        <w:t xml:space="preserve">is essential. Model-dependent adversarial attacks are generated directly against EfficientNet-B0. </w:t>
-      </w:r>
-    </w:p>
-    <w:p>
-      <w:r>
-        <w:t>When the same artifacts are evaluated on the other proxies or commercial systems, I measure empirical transfer</w:t>
-      </w:r>
-      <w:r>
-        <w:t xml:space="preserve"> rather </w:t>
-      </w:r>
-      <w:r>
-        <w:t>a direct attack. Color Shift and the five anti-forensic transformations are model-agnostic conditions.</w:t>
+        <w:t xml:space="preserve">Attack knowledge and evaluation role are separate. FGSM, Sigma Zero, and the internal SuperDeepFool adapter use gradients; One Pixel uses scores. EfficientNet-B0 is the designated source model.</w:t>
+      </w:r>
+      <w:r>
+        <w:t xml:space="preserve"/>
+      </w:r>
+      <w:r>
+        <w:t xml:space="preserve"/>
+      </w:r>
+      <w:r>
+        <w:t xml:space="preserve"/>
+      </w:r>
+    </w:p>
+    <w:p>
+      <w:r>
+        <w:t>The other proxies measure cross-model transfer, while commercial systems provide empirical responses to transferred artifacts. Color Shift and the five anti-forensic transformations are model-agnostic.</w:t>
+      </w:r>
+      <w:r>
+        <w:t xml:space="preserve"/>
+      </w:r>
+      <w:r>
+        <w:t/>
       </w:r>
     </w:p>
     <w:p>
@@ -627,7 +627,7 @@
         <w:pStyle w:val="Titolo2"/>
       </w:pPr>
       <w:r>
-        <w:t>Slide 08 — Direct-target collapse did not transfer uniformly</w:t>
+        <w:t>Slide 08 — Source-model collapse did not transfer uniformly</w:t>
       </w:r>
     </w:p>
     <w:p>
@@ -636,7 +636,7 @@
           <w:b/>
           <w:bCs/>
         </w:rPr>
-        <w:t>This slide shows the difference between direct vulnerability and transferability.</w:t>
+        <w:t>This slide distinguishes source-model evaluation from cross-model transfer.</w:t>
       </w:r>
     </w:p>
     <w:p>
@@ -678,11 +678,11 @@
     <w:p>
       <w:proofErr w:type="gramStart"/>
       <w:r>
-        <w:t>So</w:t>
+        <w:t>These results show severe source-model vulnerability for EfficientNet-B0 and much smaller cross-model effects under the tested conditions. Limited transfer does not establish direct robustness of ResNet18 or CLIP because no attacks were optimized against them.</w:t>
       </w:r>
       <w:proofErr w:type="gramEnd"/>
       <w:r>
-        <w:t xml:space="preserve"> these results support two different conclusions. EfficientNet-B0 shows a severe direct-target vulnerability, while cross-architecture transfer is much more limited under these frozen conditions.</w:t>
+        <w:t xml:space="preserve"/>
       </w:r>
     </w:p>
     <w:p>
@@ -728,17 +728,17 @@
           <w:b/>
           <w:bCs/>
         </w:rPr>
-        <w:t>Transition:</w:t>
-      </w:r>
-      <w:r>
-        <w:t xml:space="preserve"> </w:t>
+        <w:t>Transition: The commercial black-box results show configuration-dependent responses to the transferred artifacts.</w:t>
+      </w:r>
+      <w:r>
+        <w:t xml:space="preserve"/>
       </w:r>
       <w:r>
         <w:rPr>
           <w:i/>
           <w:iCs/>
         </w:rPr>
-        <w:t>The commercial black-box results show that transfer is also strongly configuration-dependent.</w:t>
+        <w:t/>
       </w:r>
     </w:p>
     <w:p>
@@ -746,12 +746,12 @@
         <w:pStyle w:val="Titolo2"/>
       </w:pPr>
       <w:r>
-        <w:t>Slide 09 — Black-box transfer was configuration-dependent</w:t>
-      </w:r>
-    </w:p>
-    <w:p>
-      <w:r>
-        <w:t>This heatmap summarizes empirical transfer on the commercial black-box configurations.</w:t>
+        <w:t>Slide 09 — Black-box responses depended on configuration</w:t>
+      </w:r>
+    </w:p>
+    <w:p>
+      <w:r>
+        <w:t>This heatmap summarizes empirical responses to EfficientNet-B0-generated artifacts across the commercial black-box configurations.</w:t>
       </w:r>
     </w:p>
     <w:p>
@@ -762,42 +762,42 @@
     <w:p>
       <w:r>
         <w:lastRenderedPageBreak/>
-        <w:t xml:space="preserve">The largest observed transfer effects are produced by Sigma Zero on </w:t>
+        <w:t xml:space="preserve">The largest observed accuracy changes occur for Sigma Zero artifacts on Excire D50 and D80, with drops of 20.2 and 25.8 percentage points.</w:t>
       </w:r>
       <w:proofErr w:type="spellStart"/>
       <w:r>
-        <w:t>Excire</w:t>
+        <w:t/>
       </w:r>
       <w:proofErr w:type="spellEnd"/>
       <w:r>
-        <w:t xml:space="preserve"> D50 and D80, with </w:t>
-      </w:r>
-      <w:r>
-        <w:t xml:space="preserve">highest accuracy </w:t>
-      </w:r>
-      <w:r>
-        <w:t>drop</w:t>
-      </w:r>
-      <w:r>
-        <w:t xml:space="preserve"> down</w:t>
-      </w:r>
-      <w:r>
-        <w:t>.</w:t>
-      </w:r>
-    </w:p>
-    <w:p>
-      <w:r>
-        <w:t>These are transfer results from EfficientNet-B0 artifacts. They are not direct attacks against the proprietary models, because their internal models and gradients are not available.</w:t>
-      </w:r>
-      <w:r>
-        <w:t xml:space="preserve"> </w:t>
+        <w:t xml:space="preserve"/>
+      </w:r>
+      <w:r>
+        <w:t xml:space="preserve"/>
+      </w:r>
+      <w:r>
+        <w:t/>
+      </w:r>
+      <w:r>
+        <w:t xml:space="preserve"/>
+      </w:r>
+      <w:r>
+        <w:t/>
+      </w:r>
+    </w:p>
+    <w:p>
+      <w:r>
+        <w:t>These artifacts were generated on EfficientNet-B0, not optimized against the proprietary models. FGSM, Sigma Zero, and SuperDeepFool were exported as 224 × 224 PNGs, while clean inputs retained native formats and sizes; One Pixel also used PNG serialization. Without a representation-matched clean control, the observed response may combine perturbation, resizing, and serialization effects.</w:t>
+      </w:r>
+      <w:r>
+        <w:t xml:space="preserve"/>
       </w:r>
       <w:r>
         <w:rPr>
           <w:b/>
           <w:bCs/>
         </w:rPr>
-        <w:t>( TOGLIERLO??)</w:t>
+        <w:t/>
       </w:r>
     </w:p>
     <w:p>
@@ -1071,7 +1071,7 @@
     </w:p>
     <w:p>
       <w:r>
-        <w:t>The main limitations are the 1,500-image corpus with one reviewer, one frozen parameter setting for each perturbation condition, direct model-dependent attacks only against EfficientNet-B0, and commercial outputs that depend on the specific tool version and configuration.</w:t>
+        <w:t>The main limitations are the 1,500-image corpus with one reviewer, one setting per perturbation, the bounded One Pixel search, and generation only on EfficientNet-B0. SuperDeepFool results concern an internal single-cycle L2 adapter rather than the full published method. Commercial responses also depend on tool version, configuration, output mapping, and representation differences from native clean inputs.</w:t>
       </w:r>
     </w:p>
     <w:p>
@@ -1118,7 +1118,7 @@
     </w:p>
     <w:p>
       <w:r>
-        <w:t>Second, direct attacks, empirical transfer, out-of-distribution behavior, and configuration trade-offs are different dimensions and should not be mixed into one single measure.</w:t>
+        <w:t>Second, source-model evaluation, cross-model transfer, commercial responses, out-of-distribution behavior, and configuration trade-offs are different dimensions and should be interpreted separately.</w:t>
       </w:r>
     </w:p>
     <w:p>
@@ -1218,12 +1218,131 @@
     </w:p>
     <w:p>
       <w:r>
-        <w:t>The thesis has four research questions. RQ1 evaluates whether the proxy models maintain clean-baseline performance under separate OOD, adversarial, and anti-forensic conditions. RQ2 separates direct source-model attacks, cross-architecture transfer, and model-agnostic Color Shift. RQ3 examines how black-box outputs and configuration choices shape the observed operational profiles. RQ4 focuses on which directional errors, degradations, OOD assignments, and unknown states matter for continued human review.</w:t>
+        <w:t>The thesis has four research questions. RQ1 evaluates proxy behavior under separate OOD, adversarial, and anti-forensic conditions. RQ2 compares proxy responses under source-model evaluation, empirical cross-model transfer, and model-agnostic Color Shift. RQ3 examines black-box outputs and configuration-dependent profiles. RQ4 addresses directional errors, degradations, OOD assignments, and unknown states relevant to continued human review.</w:t>
       </w:r>
     </w:p>
     <w:p>
       <w:r>
         <w:t>The claim scope is deliberately limited: this is an operational robustness assessment under one frozen and traceable protocol. It is not a certification, a legal-admissibility assessment, or a universal product ranking.</w:t>
+      </w:r>
+    </w:p>
+    <w:p>
+      <w:r>
+        <w:rPr>
+          <w:b/>
+        </w:rPr>
+        <w:t xml:space="preserve">Keywords: RQ1 conditions → RQ2 source evaluation / cross-model transfer / Color Shift → RQ3 configurations → RQ4 directional errors</w:t>
+      </w:r>
+      <w:r>
+        <w:rPr>
+          <w:i/>
+        </w:rPr>
+        <w:t/>
+      </w:r>
+    </w:p>
+    <w:p>
+      <w:pPr>
+        <w:pStyle w:val="Titolo2"/>
+      </w:pPr>
+      <w:r>
+        <w:t>Backup B2 — Perturbation suite and threat paths</w:t>
+      </w:r>
+    </w:p>
+    <w:p>
+      <w:r>
+        <w:rPr>
+          <w:b/>
+        </w:rPr>
+        <w:t xml:space="preserve">Use when: </w:t>
+      </w:r>
+      <w:r>
+        <w:t>The commission asks: “Which attacks and transformations did you evaluate?” or “Which ones are direct attacks?”</w:t>
+      </w:r>
+    </w:p>
+    <w:p>
+      <w:r>
+        <w:rPr>
+          <w:b/>
+        </w:rPr>
+        <w:t>Answer:</w:t>
+      </w:r>
+    </w:p>
+    <w:p>
+      <w:r>
+        <w:t xml:space="preserve">The adversarial or adversarial-style group includes FGSM, One Pixel, Sigma Zero, </w:t>
+      </w:r>
+      <w:proofErr w:type="spellStart"/>
+      <w:r>
+        <w:t>SuperDeepFool</w:t>
+      </w:r>
+      <w:proofErr w:type="spellEnd"/>
+      <w:r>
+        <w:t>, and deterministic Color Shift. The anti-forensic group includes JPEG recompression, resampling or resize, Gaussian blur, histogram modification, and contrast stretching.</w:t>
+      </w:r>
+    </w:p>
+    <w:p>
+      <w:r>
+        <w:t>Attack knowledge is gradient-based for FGSM, Sigma Zero, and the internal SuperDeepFool adapter, and score-based for One Pixel. All three proxies are inspectable and white-box-capable, but only EfficientNet-B0 was used for model-dependent generation. ResNet18 and CLIP measure cross-model transfer; commercial systems provide empirical responses. Color Shift and the anti-forensic transformations are model-agnostic.</w:t>
+      </w:r>
+    </w:p>
+    <w:p>
+      <w:r>
+        <w:rPr>
+          <w:b/>
+        </w:rPr>
+        <w:t xml:space="preserve">Keywords: gradient-based / score-based / model-agnostic → EfficientNet source → proxy transfer → commercial response</w:t>
+      </w:r>
+      <w:r>
+        <w:rPr>
+          <w:i/>
+        </w:rPr>
+        <w:t/>
+      </w:r>
+    </w:p>
+    <w:p>
+      <w:pPr>
+        <w:pStyle w:val="Titolo2"/>
+      </w:pPr>
+      <w:r>
+        <w:t>Backup B3 — Traceability links sources to reported figures</w:t>
+      </w:r>
+    </w:p>
+    <w:p>
+      <w:r>
+        <w:rPr>
+          <w:b/>
+        </w:rPr>
+        <w:t xml:space="preserve">Use when: </w:t>
+      </w:r>
+      <w:r>
+        <w:t>The commission asks: “How can a reported result be audited?” or “How reproducible is the experiment?”</w:t>
+      </w:r>
+    </w:p>
+    <w:p>
+      <w:r>
+        <w:rPr>
+          <w:b/>
+        </w:rPr>
+        <w:t>Answer:</w:t>
+      </w:r>
+    </w:p>
+    <w:p>
+      <w:r>
+        <w:t xml:space="preserve">A reported result can be followed through a complete chain. I start </w:t>
+      </w:r>
+      <w:proofErr w:type="gramStart"/>
+      <w:r>
+        <w:t>from</w:t>
+      </w:r>
+      <w:proofErr w:type="gramEnd"/>
+      <w:r>
+        <w:t xml:space="preserve"> the source manifest and manual review, then use the source-condition identifier to link the derived variant. From there I can identify the proxy prediction or normalized commercial output, the metric table, and finally the figure or conclusion reported in the thesis.</w:t>
+      </w:r>
+    </w:p>
+    <w:p>
+      <w:r>
+        <w:lastRenderedPageBreak/>
+        <w:t>Integrity is supported by SHA-256 digests, frozen model and tool-version registries, frozen configurations, and explicit normalization rules. The repository scripts regenerate the main metrics and thesis-ready reporting assets.</w:t>
       </w:r>
     </w:p>
     <w:p>
@@ -1237,7 +1356,7 @@
         <w:rPr>
           <w:i/>
         </w:rPr>
-        <w:t>RQ1 robustness conditions → RQ2 direct vs transfer → RQ3 black-box configuration → RQ4 operational risk → protocol-specific scope</w:t>
+        <w:t>source → derivation → decision → metric → report → SHA-256 → frozen registries</w:t>
       </w:r>
     </w:p>
     <w:p>
@@ -1245,7 +1364,7 @@
         <w:pStyle w:val="Titolo2"/>
       </w:pPr>
       <w:r>
-        <w:t>Backup B2 — Perturbation suite and threat paths</w:t>
+        <w:t>Backup B4 — Commercial clean metrics and OOD behavior</w:t>
       </w:r>
     </w:p>
     <w:p>
@@ -1256,7 +1375,7 @@
         <w:t xml:space="preserve">Use when: </w:t>
       </w:r>
       <w:r>
-        <w:t>The commission asks: “Which attacks and transformations did you evaluate?” or “Which ones are direct attacks?”</w:t>
+        <w:t>The commission asks for an exact number or compares two commercial configurations.</w:t>
       </w:r>
     </w:p>
     <w:p>
@@ -1269,20 +1388,33 @@
     </w:p>
     <w:p>
       <w:r>
-        <w:t xml:space="preserve">The adversarial or adversarial-style group includes FGSM, One Pixel, Sigma Zero, </w:t>
+        <w:t>This table reports clean binary accuracy, recall, false-negative rate, false-positive rate, and a separate OOD weapon-assignment rate for each frozen configuration.</w:t>
+      </w:r>
+    </w:p>
+    <w:p>
+      <w:r>
+        <w:t xml:space="preserve">For example, </w:t>
       </w:r>
       <w:proofErr w:type="spellStart"/>
       <w:r>
-        <w:t>SuperDeepFool</w:t>
+        <w:t>Griffeye</w:t>
       </w:r>
       <w:proofErr w:type="spellEnd"/>
       <w:r>
-        <w:t>, and deterministic Color Shift. The anti-forensic group includes JPEG recompression, resampling or resize, Gaussian blur, histogram modification, and contrast stretching.</w:t>
-      </w:r>
-    </w:p>
-    <w:p>
-      <w:r>
-        <w:t>The critical distinction is the threat path. Model-dependent attacks are generated directly only against EfficientNet-B0. When those same files are evaluated on ResNet18, CLIP, or the commercial systems, the result is empirical transfer. Color Shift and all five anti-forensic transformations are model-agnostic conditions.</w:t>
+        <w:t xml:space="preserve">/T3K has 97.8 percent clean accuracy and 0.8 percent FPR in this protocol, while </w:t>
+      </w:r>
+      <w:proofErr w:type="spellStart"/>
+      <w:r>
+        <w:t>Excire</w:t>
+      </w:r>
+      <w:proofErr w:type="spellEnd"/>
+      <w:r>
+        <w:t xml:space="preserve"> D80 has the lowest FNR at 1.4 percent but a much higher FPR of 15.6 percent and an OOD weapon-assignment rate of 52.2 percent.</w:t>
+      </w:r>
+    </w:p>
+    <w:p>
+      <w:r>
+        <w:t>I would not use the table to declare a universally best product. These rows describe operating profiles under specific tool versions, settings, mappings, and one frozen dataset.</w:t>
       </w:r>
     </w:p>
     <w:p>
@@ -1296,7 +1428,7 @@
         <w:rPr>
           <w:i/>
         </w:rPr>
-        <w:t>5 adversarial/adversarial-style → 5 anti-forensic → direct only EfficientNet-B0 → transfer elsewhere → model-agnostic Color Shift/AF</w:t>
+        <w:t>exact numbers → clean and OOD separate → operating profiles → no universal ranking</w:t>
       </w:r>
     </w:p>
     <w:p>
@@ -1304,7 +1436,7 @@
         <w:pStyle w:val="Titolo2"/>
       </w:pPr>
       <w:r>
-        <w:t>Backup B3 — Traceability links sources to reported figures</w:t>
+        <w:t>Backup B5 — Fixed adversarial settings and claim boundaries</w:t>
       </w:r>
     </w:p>
     <w:p>
@@ -1315,7 +1447,7 @@
         <w:t xml:space="preserve">Use when: </w:t>
       </w:r>
       <w:r>
-        <w:t>The commission asks: “How can a reported result be audited?” or “How reproducible is the experiment?”</w:t>
+        <w:t>The commission asks: “Which attack parameters did you use?” or “Were the attacks reproducible?”</w:t>
       </w:r>
     </w:p>
     <w:p>
@@ -1328,21 +1460,118 @@
     </w:p>
     <w:p>
       <w:r>
-        <w:t xml:space="preserve">A reported result can be followed through a complete chain. I start </w:t>
+        <w:t>FGSM uses a fixed epsilon of 8/255, with precedent in RobustBench CIFAR evaluation; this is not a forensic standard, and no epsilon sweep was performed. One Pixel uses score-based Differential Evolution over x, y, R, G, and B, with 50 maximum iterations, 100 candidates, seed 42, and stopping at a generation boundary after misclassification. This is a smaller budget than the original 400-candidate, 100-iteration setting; limited effectiveness does not establish general robustness.</w:t>
+      </w:r>
+    </w:p>
+    <w:p>
+      <w:r>
+        <w:t xml:space="preserve">Sigma Zero uses the defaults of the pinned adversarial-library reference function: 1,000 steps, eta zero 1.0, sigma 0.001, tau zero 0.3, threshold factor 0.01, and infinity-norm gradient normalization. The internal SuperDeepFool adapter uses L2 geometry, at most 50 DeepFool iterations, and one projection. Although the configured outer cap is 20, all 1,000 records show one executed cycle; failed projection falls back to the boundary point. This differs from the repeated boundary/projection procedure of published SDF infinity-one. Infinity denotes the inner iteration variant, not an L-infinity perturbation norm. Results describe this bounded internal adapter; Color Shift remains model-agnostic.</w:t>
+      </w:r>
+      <w:proofErr w:type="spellStart"/>
+      <w:r>
+        <w:t/>
+      </w:r>
+      <w:proofErr w:type="spellEnd"/>
+      <w:r>
+        <w:t xml:space="preserve"/>
+      </w:r>
+      <w:proofErr w:type="spellStart"/>
+      <w:r>
+        <w:t/>
+      </w:r>
+      <w:proofErr w:type="spellEnd"/>
+      <w:r>
+        <w:t xml:space="preserve"/>
+      </w:r>
+    </w:p>
+    <w:p>
+      <w:r>
+        <w:rPr>
+          <w:b/>
+        </w:rPr>
+        <w:t xml:space="preserve">Keywords: FGSM fixed 8/255 → One Pixel bounded 50/100 → Sigma Zero reference defaults → SDF internal L2 / one cycle</w:t>
+      </w:r>
+      <w:r>
+        <w:rPr>
+          <w:i/>
+        </w:rPr>
+        <w:t xml:space="preserve"/>
+      </w:r>
+      <w:proofErr w:type="spellStart"/>
+      <w:r>
+        <w:rPr>
+          <w:i/>
+        </w:rPr>
+        <w:t/>
+      </w:r>
+      <w:proofErr w:type="spellEnd"/>
+      <w:r>
+        <w:rPr>
+          <w:i/>
+        </w:rPr>
+        <w:t xml:space="preserve"/>
+      </w:r>
+    </w:p>
+    <w:p>
+      <w:pPr>
+        <w:pStyle w:val="Titolo2"/>
+      </w:pPr>
+      <w:r>
+        <w:t>Backup B6 — Frozen anti-forensic settings</w:t>
+      </w:r>
+    </w:p>
+    <w:p>
+      <w:r>
+        <w:rPr>
+          <w:b/>
+        </w:rPr>
+        <w:t xml:space="preserve">Use when: </w:t>
+      </w:r>
+      <w:r>
+        <w:t>The commission asks: “How did you control the anti-forensic transformations?”</w:t>
+      </w:r>
+    </w:p>
+    <w:p>
+      <w:r>
+        <w:rPr>
+          <w:b/>
+        </w:rPr>
+        <w:t>Answer:</w:t>
+      </w:r>
+    </w:p>
+    <w:p>
+      <w:r>
+        <w:t xml:space="preserve">Each anti-forensic condition uses one frozen, model-agnostic setting. JPEG recompression uses quality 70 without changing dimensions. Resize </w:t>
+      </w:r>
+      <w:proofErr w:type="spellStart"/>
+      <w:r>
+        <w:t>downsamples</w:t>
+      </w:r>
+      <w:proofErr w:type="spellEnd"/>
+      <w:r>
+        <w:t xml:space="preserve"> to 50 percent and </w:t>
       </w:r>
       <w:proofErr w:type="gramStart"/>
       <w:r>
-        <w:t>from</w:t>
+        <w:t>restores</w:t>
       </w:r>
       <w:proofErr w:type="gramEnd"/>
       <w:r>
-        <w:t xml:space="preserve"> the source manifest and manual review, then use the source-condition identifier to link the derived variant. From there I can identify the proxy prediction or normalized commercial output, the metric table, and finally the figure or conclusion reported in the thesis.</w:t>
+        <w:t xml:space="preserve"> the original size with bicubic interpolation. Gaussian blur uses radius 1.5. Histogram modification applies per-channel equalization, while contrast stretching uses </w:t>
+      </w:r>
+      <w:proofErr w:type="spellStart"/>
+      <w:r>
+        <w:t>autocontrast</w:t>
+      </w:r>
+      <w:proofErr w:type="spellEnd"/>
+      <w:r>
+        <w:t xml:space="preserve"> with a 1 percent cutoff.</w:t>
       </w:r>
     </w:p>
     <w:p>
       <w:r>
         <w:lastRenderedPageBreak/>
-        <w:t>Integrity is supported by SHA-256 digests, frozen model and tool-version registries, frozen configurations, and explicit normalization rules. The repository scripts regenerate the main metrics and thesis-ready reporting assets.</w:t>
+        <w:t>The other transformations use JPEG quality 95. Each condition contains 1,000 source-linked artifacts for controlled paired comparison at one predefined setting. These results characterize the tested conditions, not a complete severity-response curve.</w:t>
       </w:r>
     </w:p>
     <w:p>
@@ -1356,7 +1585,21 @@
         <w:rPr>
           <w:i/>
         </w:rPr>
-        <w:t>source → derivation → decision → metric → report → SHA-256 → frozen registries</w:t>
+        <w:t xml:space="preserve">JPEG q70 → resize 50% bicubic → blur 1.5 → histogram equalization → </w:t>
+      </w:r>
+      <w:proofErr w:type="spellStart"/>
+      <w:r>
+        <w:rPr>
+          <w:i/>
+        </w:rPr>
+        <w:t>autocontrast</w:t>
+      </w:r>
+      <w:proofErr w:type="spellEnd"/>
+      <w:r>
+        <w:rPr>
+          <w:i/>
+        </w:rPr>
+        <w:t xml:space="preserve"> 1% → frozen/model-agnostic</w:t>
       </w:r>
     </w:p>
     <w:p>
@@ -1364,7 +1607,7 @@
         <w:pStyle w:val="Titolo2"/>
       </w:pPr>
       <w:r>
-        <w:t>Backup B4 — Commercial clean metrics and OOD behavior</w:t>
+        <w:t>Backup B7 — How heterogeneous outputs became comparable</w:t>
       </w:r>
     </w:p>
     <w:p>
@@ -1375,7 +1618,7 @@
         <w:t xml:space="preserve">Use when: </w:t>
       </w:r>
       <w:r>
-        <w:t>The commission asks for an exact number or compares two commercial configurations.</w:t>
+        <w:t>The commission asks: “How did you compare tools that produce different kinds of outputs?”</w:t>
       </w:r>
     </w:p>
     <w:p>
@@ -1388,12 +1631,12 @@
     </w:p>
     <w:p>
       <w:r>
-        <w:t>This table reports clean binary accuracy, recall, false-negative rate, false-positive rate, and a separate OOD weapon-assignment rate for each frozen configuration.</w:t>
-      </w:r>
-    </w:p>
-    <w:p>
-      <w:r>
-        <w:t xml:space="preserve">For example, </w:t>
+        <w:t>I did not assume that the commercial systems expose the same classifier interface. Instead, I defined a frozen mapping for the analyst-visible output of each system.</w:t>
+      </w:r>
+    </w:p>
+    <w:p>
+      <w:r>
+        <w:t xml:space="preserve">Magnet uses the “Possible weapons” tag. </w:t>
       </w:r>
       <w:proofErr w:type="spellStart"/>
       <w:r>
@@ -1401,7 +1644,7 @@
       </w:r>
       <w:proofErr w:type="spellEnd"/>
       <w:r>
-        <w:t xml:space="preserve">/T3K has 97.8 percent clean accuracy and 0.8 percent FPR in this protocol, while </w:t>
+        <w:t xml:space="preserve">/T3K uses the CORE/Violence/Firearm bookmark. </w:t>
       </w:r>
       <w:proofErr w:type="spellStart"/>
       <w:r>
@@ -1409,12 +1652,12 @@
       </w:r>
       <w:proofErr w:type="spellEnd"/>
       <w:r>
-        <w:t xml:space="preserve"> D80 has the lowest FNR at 1.4 percent but a much higher FPR of 15.6 percent and an OOD weapon-assignment rate of 52.2 percent.</w:t>
-      </w:r>
-    </w:p>
-    <w:p>
-      <w:r>
-        <w:t>I would not use the table to declare a universally best product. These rows describe operating profiles under specific tool versions, settings, mappings, and one frozen dataset.</w:t>
+        <w:t xml:space="preserve"> uses a hit in at least one of eight frozen firearm-oriented prompt lists, with D20, D50, and D80 kept as separate configurations. Cellebrite uses the “Armi”, “Pistola”, or “Fucile” classifications.</w:t>
+      </w:r>
+    </w:p>
+    <w:p>
+      <w:r>
+        <w:t>The observable states are mapped to weapon, non-weapon, or unknown. Unsupported output is never silently converted to negative. No unknown state occurred in the final 69,000 normalized decisions.</w:t>
       </w:r>
     </w:p>
     <w:p>
@@ -1428,7 +1671,7 @@
         <w:rPr>
           <w:i/>
         </w:rPr>
-        <w:t>exact numbers → clean and OOD separate → operating profiles → no universal ranking</w:t>
+        <w:t>observable outputs → frozen mapping → per-tool rule → unsupported = unknown, never negative → 0 unknown final</w:t>
       </w:r>
     </w:p>
     <w:p>
@@ -1436,7 +1679,7 @@
         <w:pStyle w:val="Titolo2"/>
       </w:pPr>
       <w:r>
-        <w:t>Backup B5 — Adversarial settings were frozen before evaluation</w:t>
+        <w:t>Backup B8 — Metric denominators keep comparisons honest</w:t>
       </w:r>
     </w:p>
     <w:p>
@@ -1447,7 +1690,7 @@
         <w:t xml:space="preserve">Use when: </w:t>
       </w:r>
       <w:r>
-        <w:t>The commission asks: “Which attack parameters did you use?” or “Were the attacks reproducible?”</w:t>
+        <w:t>The commission asks about FNR, FPR, OOD rates, or why denominators differ.</w:t>
       </w:r>
     </w:p>
     <w:p>
@@ -1460,28 +1703,22 @@
     </w:p>
     <w:p>
       <w:r>
-        <w:t>All adversarial settings were frozen before evaluation. FGSM is untargeted with epsilon equal to 8 over 255 in pixel space and uses the fold-aware white-box EfficientNet-B0 checkpoint. One Pixel uses differential evolution over x, y, R, G, and B, with 50 iterations, an effective population of about 100, seed 42, and early stopping after misclassification.</w:t>
-      </w:r>
-    </w:p>
-    <w:p>
-      <w:r>
-        <w:t xml:space="preserve">Sigma Zero uses 1,000 steps with eta zero 1.0, sigma 0.001, and tau zero 0.3. </w:t>
+        <w:t>Accuracy is the proportion of correct evaluated binary decisions. FNR is false negatives divided by true positives plus false negatives, so operationally it represents missed-target risk. FPR is false positives divided by false positives plus true negatives, so it represents additional review workload.</w:t>
+      </w:r>
+    </w:p>
+    <w:p>
+      <w:r>
+        <w:t xml:space="preserve">OOD weapon assignment is reported separately because OOD images do not belong to the supervised weapon/non-weapon task. For proxy OOD evaluation, </w:t>
       </w:r>
       <w:proofErr w:type="spellStart"/>
-      <w:r>
-        <w:t>SuperDeepFool</w:t>
+      <w:proofErr w:type="gramStart"/>
+      <w:r>
+        <w:t>five fold</w:t>
       </w:r>
       <w:proofErr w:type="spellEnd"/>
-      <w:r>
-        <w:t xml:space="preserve"> uses SDF infinity-one, with 20 outer iterations, 50 inner </w:t>
-      </w:r>
-      <w:proofErr w:type="spellStart"/>
-      <w:r>
-        <w:t>DeepFool</w:t>
-      </w:r>
-      <w:proofErr w:type="spellEnd"/>
-      <w:r>
-        <w:t xml:space="preserve"> iterations, and one projection step. Color Shift is deterministic and model-agnostic.</w:t>
+      <w:proofErr w:type="gramEnd"/>
+      <w:r>
+        <w:t>-specific checkpoints produce 2,500 responses from 500 images. Each commercial configuration produces one decision per OOD image, so its denominator is 500. Unknown outputs would be excluded from binary denominators and reported separately.</w:t>
       </w:r>
     </w:p>
     <w:p>
@@ -1495,21 +1732,7 @@
         <w:rPr>
           <w:i/>
         </w:rPr>
-        <w:t xml:space="preserve">FGSM 8/255 → One Pixel DE 50/100 seed42 → Sigma Zero 1000 steps → SDF 20/50/1 → </w:t>
-      </w:r>
-      <w:proofErr w:type="spellStart"/>
-      <w:r>
-        <w:rPr>
-          <w:i/>
-        </w:rPr>
-        <w:t>EfficientNet</w:t>
-      </w:r>
-      <w:proofErr w:type="spellEnd"/>
-      <w:r>
-        <w:rPr>
-          <w:i/>
-        </w:rPr>
-        <w:t xml:space="preserve"> target</w:t>
+        <w:t>FNR = misses → FPR = workload → OOD separate → proxy denominator 2,500 → commercial denominator 500</w:t>
       </w:r>
     </w:p>
     <w:p>
@@ -1517,7 +1740,7 @@
         <w:pStyle w:val="Titolo2"/>
       </w:pPr>
       <w:r>
-        <w:t>Backup B6 — Frozen anti-forensic settings</w:t>
+        <w:t>Backup B9 — Limitations define the next validation steps</w:t>
       </w:r>
     </w:p>
     <w:p>
@@ -1528,7 +1751,7 @@
         <w:t xml:space="preserve">Use when: </w:t>
       </w:r>
       <w:r>
-        <w:t>The commission asks: “How did you control the anti-forensic transformations?”</w:t>
+        <w:t>The commission asks: “What would you do next?” or “How generalizable are these results?”</w:t>
       </w:r>
     </w:p>
     <w:p>
@@ -1541,230 +1764,7 @@
     </w:p>
     <w:p>
       <w:r>
-        <w:t xml:space="preserve">Each anti-forensic condition uses one frozen, model-agnostic setting. JPEG recompression uses quality 70 without changing dimensions. Resize </w:t>
-      </w:r>
-      <w:proofErr w:type="spellStart"/>
-      <w:r>
-        <w:t>downsamples</w:t>
-      </w:r>
-      <w:proofErr w:type="spellEnd"/>
-      <w:r>
-        <w:t xml:space="preserve"> to 50 percent and </w:t>
-      </w:r>
-      <w:proofErr w:type="gramStart"/>
-      <w:r>
-        <w:t>restores</w:t>
-      </w:r>
-      <w:proofErr w:type="gramEnd"/>
-      <w:r>
-        <w:t xml:space="preserve"> the original size with bicubic interpolation. Gaussian blur uses radius 1.5. Histogram modification applies per-channel equalization, while contrast stretching uses </w:t>
-      </w:r>
-      <w:proofErr w:type="spellStart"/>
-      <w:r>
-        <w:t>autocontrast</w:t>
-      </w:r>
-      <w:proofErr w:type="spellEnd"/>
-      <w:r>
-        <w:t xml:space="preserve"> with a 1 percent cutoff.</w:t>
-      </w:r>
-    </w:p>
-    <w:p>
-      <w:r>
-        <w:lastRenderedPageBreak/>
-        <w:t>The transformations other than the dedicated JPEG recompression condition are serialized at JPEG quality 95. Each condition contains 1,000 source-linked artifacts, so comparisons remain paired to the same binary source population.</w:t>
-      </w:r>
-    </w:p>
-    <w:p>
-      <w:r>
-        <w:rPr>
-          <w:b/>
-        </w:rPr>
-        <w:t xml:space="preserve">Keywords: </w:t>
-      </w:r>
-      <w:r>
-        <w:rPr>
-          <w:i/>
-        </w:rPr>
-        <w:t xml:space="preserve">JPEG q70 → resize 50% bicubic → blur 1.5 → histogram equalization → </w:t>
-      </w:r>
-      <w:proofErr w:type="spellStart"/>
-      <w:r>
-        <w:rPr>
-          <w:i/>
-        </w:rPr>
-        <w:t>autocontrast</w:t>
-      </w:r>
-      <w:proofErr w:type="spellEnd"/>
-      <w:r>
-        <w:rPr>
-          <w:i/>
-        </w:rPr>
-        <w:t xml:space="preserve"> 1% → frozen/model-agnostic</w:t>
-      </w:r>
-    </w:p>
-    <w:p>
-      <w:pPr>
-        <w:pStyle w:val="Titolo2"/>
-      </w:pPr>
-      <w:r>
-        <w:t>Backup B7 — How heterogeneous outputs became comparable</w:t>
-      </w:r>
-    </w:p>
-    <w:p>
-      <w:r>
-        <w:rPr>
-          <w:b/>
-        </w:rPr>
-        <w:t xml:space="preserve">Use when: </w:t>
-      </w:r>
-      <w:r>
-        <w:t>The commission asks: “How did you compare tools that produce different kinds of outputs?”</w:t>
-      </w:r>
-    </w:p>
-    <w:p>
-      <w:r>
-        <w:rPr>
-          <w:b/>
-        </w:rPr>
-        <w:t>Answer:</w:t>
-      </w:r>
-    </w:p>
-    <w:p>
-      <w:r>
-        <w:t>I did not assume that the commercial systems expose the same classifier interface. Instead, I defined a frozen mapping for the analyst-visible output of each system.</w:t>
-      </w:r>
-    </w:p>
-    <w:p>
-      <w:r>
-        <w:t xml:space="preserve">Magnet uses the “Possible weapons” tag. </w:t>
-      </w:r>
-      <w:proofErr w:type="spellStart"/>
-      <w:r>
-        <w:t>Griffeye</w:t>
-      </w:r>
-      <w:proofErr w:type="spellEnd"/>
-      <w:r>
-        <w:t xml:space="preserve">/T3K uses the CORE/Violence/Firearm bookmark. </w:t>
-      </w:r>
-      <w:proofErr w:type="spellStart"/>
-      <w:r>
-        <w:t>Excire</w:t>
-      </w:r>
-      <w:proofErr w:type="spellEnd"/>
-      <w:r>
-        <w:t xml:space="preserve"> uses a hit in at least one of eight frozen firearm-oriented prompt lists, with D20, D50, and D80 kept as separate configurations. Cellebrite uses the “Armi”, “Pistola”, or “Fucile” classifications.</w:t>
-      </w:r>
-    </w:p>
-    <w:p>
-      <w:r>
-        <w:t>The observable states are mapped to weapon, non-weapon, or unknown. Unsupported output is never silently converted to negative. No unknown state occurred in the final 69,000 normalized decisions.</w:t>
-      </w:r>
-    </w:p>
-    <w:p>
-      <w:r>
-        <w:rPr>
-          <w:b/>
-        </w:rPr>
-        <w:t xml:space="preserve">Keywords: </w:t>
-      </w:r>
-      <w:r>
-        <w:rPr>
-          <w:i/>
-        </w:rPr>
-        <w:t>observable outputs → frozen mapping → per-tool rule → unsupported = unknown, never negative → 0 unknown final</w:t>
-      </w:r>
-    </w:p>
-    <w:p>
-      <w:pPr>
-        <w:pStyle w:val="Titolo2"/>
-      </w:pPr>
-      <w:r>
-        <w:t>Backup B8 — Metric denominators keep comparisons honest</w:t>
-      </w:r>
-    </w:p>
-    <w:p>
-      <w:r>
-        <w:rPr>
-          <w:b/>
-        </w:rPr>
-        <w:t xml:space="preserve">Use when: </w:t>
-      </w:r>
-      <w:r>
-        <w:t>The commission asks about FNR, FPR, OOD rates, or why denominators differ.</w:t>
-      </w:r>
-    </w:p>
-    <w:p>
-      <w:r>
-        <w:rPr>
-          <w:b/>
-        </w:rPr>
-        <w:t>Answer:</w:t>
-      </w:r>
-    </w:p>
-    <w:p>
-      <w:r>
-        <w:t>Accuracy is the proportion of correct evaluated binary decisions. FNR is false negatives divided by true positives plus false negatives, so operationally it represents missed-target risk. FPR is false positives divided by false positives plus true negatives, so it represents additional review workload.</w:t>
-      </w:r>
-    </w:p>
-    <w:p>
-      <w:r>
-        <w:t xml:space="preserve">OOD weapon assignment is reported separately because OOD images do not belong to the supervised weapon/non-weapon task. For proxy OOD evaluation, </w:t>
-      </w:r>
-      <w:proofErr w:type="spellStart"/>
-      <w:proofErr w:type="gramStart"/>
-      <w:r>
-        <w:t>five fold</w:t>
-      </w:r>
-      <w:proofErr w:type="spellEnd"/>
-      <w:proofErr w:type="gramEnd"/>
-      <w:r>
-        <w:t>-specific checkpoints produce 2,500 responses from 500 images. Each commercial configuration produces one decision per OOD image, so its denominator is 500. Unknown outputs would be excluded from binary denominators and reported separately.</w:t>
-      </w:r>
-    </w:p>
-    <w:p>
-      <w:r>
-        <w:rPr>
-          <w:b/>
-        </w:rPr>
-        <w:t xml:space="preserve">Keywords: </w:t>
-      </w:r>
-      <w:r>
-        <w:rPr>
-          <w:i/>
-        </w:rPr>
-        <w:t>FNR = misses → FPR = workload → OOD separate → proxy denominator 2,500 → commercial denominator 500</w:t>
-      </w:r>
-    </w:p>
-    <w:p>
-      <w:pPr>
-        <w:pStyle w:val="Titolo2"/>
-      </w:pPr>
-      <w:r>
-        <w:t>Backup B9 — Limitations define the next validation steps</w:t>
-      </w:r>
-    </w:p>
-    <w:p>
-      <w:r>
-        <w:rPr>
-          <w:b/>
-        </w:rPr>
-        <w:t xml:space="preserve">Use when: </w:t>
-      </w:r>
-      <w:r>
-        <w:t>The commission asks: “What would you do next?” or “How generalizable are these results?”</w:t>
-      </w:r>
-    </w:p>
-    <w:p>
-      <w:r>
-        <w:rPr>
-          <w:b/>
-        </w:rPr>
-        <w:t>Answer:</w:t>
-      </w:r>
-    </w:p>
-    <w:p>
-      <w:r>
-        <w:t>Generalizability must be tested rather than assumed from one frozen protocol. The next validation steps are to use larger and more heterogeneous datasets with multiple reviewers, perform parameter sweeps and adaptive attacks, repeat the evaluation across new commercial-tool versions to measure drift, extend the protocol beyond still images, and strengthen audit and human-review controls.</w:t>
+        <w:t>Further validation should use larger and more heterogeneous datasets with multiple reviewers, test parameter sweeps and matched attacks, evaluate the full iterative SuperDeepFool method, and include representation-matched clean controls. It should also repeat commercial evaluations across versions, extend beyond still images, and strengthen audit and human-review controls. These are future experiments, not results of the current study.</w:t>
       </w:r>
     </w:p>
     <w:p>

</xml_diff>

<commit_message>
Expose GKC threat model in defense materials
</commit_message>
<xml_diff>
--- a/Molinario_Thesis_Defense_2026_ONLY_SPEAKER_NOTES.docx
+++ b/Molinario_Thesis_Defense_2026_ONLY_SPEAKER_NOTES.docx
@@ -525,7 +525,7 @@
     <w:p>
       <w:r>
         <w:lastRenderedPageBreak/>
-        <w:t xml:space="preserve">Attack knowledge and evaluation role are separate. FGSM, Sigma Zero, and the internal SuperDeepFool adapter use gradients; One Pixel uses scores. EfficientNet-B0 is the designated source model.</w:t>
+        <w:t xml:space="preserve">The GKC threat model specifies Goal: untargeted model-dependent misclassification. Knowledge: gradients for FGSM, Sigma Zero, and the internal SuperDeepFool adapter, and scores for One Pixel. Capability: constrained image changes at inference time. EfficientNet-B0 is the designated source model.</w:t>
       </w:r>
       <w:r>
         <w:t xml:space="preserve"/>
@@ -1245,7 +1245,7 @@
         <w:pStyle w:val="Titolo2"/>
       </w:pPr>
       <w:r>
-        <w:t>Backup B2 — Perturbation suite and threat paths</w:t>
+        <w:t>Backup B2 — GKC threat model and perturbation suite</w:t>
       </w:r>
     </w:p>
     <w:p>
@@ -1256,7 +1256,7 @@
         <w:t xml:space="preserve">Use when: </w:t>
       </w:r>
       <w:r>
-        <w:t>The commission asks: “Which attacks and transformations did you evaluate?” or “Which ones are direct attacks?”</w:t>
+        <w:t>The commission asks: “What is your threat model?” or “Which attacks and transformations did you evaluate?”</w:t>
       </w:r>
     </w:p>
     <w:p>
@@ -1282,7 +1282,7 @@
     </w:p>
     <w:p>
       <w:r>
-        <w:t>Attack knowledge is gradient-based for FGSM, Sigma Zero, and the internal SuperDeepFool adapter, and score-based for One Pixel. All three proxies are inspectable and white-box-capable, but only EfficientNet-B0 was used for model-dependent generation. ResNet18 and CLIP measure cross-model transfer; commercial systems provide empirical responses. Color Shift and the anti-forensic transformations are model-agnostic.</w:t>
+        <w:t>The adversarial threat model uses Goal, Knowledge, and Capability. Goal: the model-dependent attacks seek untargeted misclassification. Knowledge: FGSM, Sigma Zero, and the internal SuperDeepFool adapter use gradients, while One Pixel uses scores. Capability: the attacker modifies image inputs at inference time within the constraints of each condition, without altering model training. All three proxies are inspectable and white-box-capable, but only EfficientNet-B0 was used for model-dependent generation. ResNet18 and CLIP measure cross-model transfer; commercial systems provide empirical responses. Color Shift and the anti-forensic transformations are model-agnostic, with anti-forensics evaluated separately from adversarial attacks.</w:t>
       </w:r>
     </w:p>
     <w:p>
@@ -1290,7 +1290,7 @@
         <w:rPr>
           <w:b/>
         </w:rPr>
-        <w:t xml:space="preserve">Keywords: gradient-based / score-based / model-agnostic → EfficientNet source → proxy transfer → commercial response</w:t>
+        <w:t xml:space="preserve">Keywords: Goal: untargeted errors → Knowledge: gradient / score / model-agnostic → Capability: constrained evasion → source / transfer / commercial response</w:t>
       </w:r>
       <w:r>
         <w:rPr>

</xml_diff>